<commit_message>
Add the correct reports.
</commit_message>
<xml_diff>
--- a/report/spotify_music_market_analysis_report.docx
+++ b/report/spotify_music_market_analysis_report.docx
@@ -2918,7 +2918,7 @@
         </w:rPr>
         <w:lastRenderedPageBreak/>
         <w:drawing>
-          <wp:anchor distT="91440" distB="91440" distL="91440" distR="91440" simplePos="0" relativeHeight="251658240" behindDoc="1" locked="0" layoutInCell="1" allowOverlap="1" wp14:anchorId="2F2500FC" wp14:editId="586B3239">
+          <wp:anchor distT="91440" distB="91440" distL="91440" distR="91440" simplePos="0" relativeHeight="251658240" behindDoc="1" locked="0" layoutInCell="1" allowOverlap="1" wp14:anchorId="2F2500FC" wp14:editId="760B648C">
             <wp:simplePos x="0" y="0"/>
             <wp:positionH relativeFrom="margin">
               <wp:posOffset>0</wp:posOffset>
@@ -5230,22 +5230,22 @@
           <w14:ligatures w14:val="none"/>
         </w:rPr>
         <w:drawing>
-          <wp:anchor distT="91440" distB="91440" distL="91440" distR="91440" simplePos="0" relativeHeight="251663360" behindDoc="1" locked="0" layoutInCell="1" allowOverlap="1" wp14:anchorId="279C5EFB" wp14:editId="40CE5D04">
+          <wp:anchor distT="91440" distB="91440" distL="91440" distR="91440" simplePos="0" relativeHeight="251663360" behindDoc="1" locked="0" layoutInCell="1" allowOverlap="1" wp14:anchorId="279C5EFB" wp14:editId="4EF3B248">
             <wp:simplePos x="0" y="0"/>
             <wp:positionH relativeFrom="margin">
-              <wp:posOffset>-928</wp:posOffset>
+              <wp:align>left</wp:align>
             </wp:positionH>
             <wp:positionV relativeFrom="paragraph">
               <wp:posOffset>22860</wp:posOffset>
             </wp:positionV>
-            <wp:extent cx="4135120" cy="1981200"/>
+            <wp:extent cx="3666490" cy="2266950"/>
             <wp:effectExtent l="0" t="0" r="0" b="0"/>
             <wp:wrapTight wrapText="right">
               <wp:wrapPolygon edited="0">
                 <wp:start x="0" y="0"/>
-                <wp:lineTo x="0" y="21392"/>
-                <wp:lineTo x="21494" y="21392"/>
-                <wp:lineTo x="21494" y="0"/>
+                <wp:lineTo x="0" y="21418"/>
+                <wp:lineTo x="21435" y="21418"/>
+                <wp:lineTo x="21435" y="0"/>
                 <wp:lineTo x="0" y="0"/>
               </wp:wrapPolygon>
             </wp:wrapTight>
@@ -5277,7 +5277,7 @@
                   <pic:spPr bwMode="auto">
                     <a:xfrm>
                       <a:off x="0" y="0"/>
-                      <a:ext cx="4135120" cy="1981200"/>
+                      <a:ext cx="3666490" cy="2266950"/>
                     </a:xfrm>
                     <a:prstGeom prst="rect">
                       <a:avLst/>

</xml_diff>